<commit_message>
v2.0: 30 contratos Pydantic - personal, mermas, compras, menu, documentos, inventario (35 unidades)
</commit_message>
<xml_diff>
--- a/docs_internos/ChefChat_SOP_Documentacion.docx
+++ b/docs_internos/ChefChat_SOP_Documentacion.docx
@@ -2630,6 +2630,920 @@
           <w:color w:val="1E3A8A"/>
           <w:sz w:val="28"/>
         </w:rPr>
+        <w:t>8. Contratos Pydantic (v2.0)</w:t>
+      </w:r>
+    </w:p>
+    <w:p>
+      <w:pPr>
+        <w:spacing w:after="120"/>
+      </w:pPr>
+      <w:r/>
+      <w:r>
+        <w:rPr>
+          <w:rFonts w:ascii="Consolas" w:hAnsi="Consolas"/>
+          <w:sz w:val="18"/>
+        </w:rPr>
+        <w:t>core/models.py</w:t>
+      </w:r>
+      <w:r>
+        <w:t xml:space="preserve"> — 30 modelos con validacion estricta de tipos, unidades, estados y fechas:</w:t>
+      </w:r>
+    </w:p>
+    <w:p>
+      <w:pPr>
+        <w:spacing w:before="200"/>
+      </w:pPr>
+      <w:r>
+        <w:rPr>
+          <w:b/>
+          <w:color w:val="1E3A8A"/>
+          <w:sz w:val="24"/>
+        </w:rPr>
+        <w:t>Personal (4 modelos)</w:t>
+      </w:r>
+    </w:p>
+    <w:tbl>
+      <w:tblPr>
+        <w:tblStyle w:val="LightGrid-Accent1"/>
+        <w:tblW w:type="auto" w:w="0"/>
+        <w:jc w:val="center"/>
+        <w:tblLook w:firstColumn="1" w:firstRow="1" w:lastColumn="0" w:lastRow="0" w:noHBand="0" w:noVBand="1" w:val="04A0"/>
+      </w:tblPr>
+      <w:tblGrid>
+        <w:gridCol w:w="3230"/>
+        <w:gridCol w:w="3230"/>
+        <w:gridCol w:w="3230"/>
+      </w:tblGrid>
+      <w:tr>
+        <w:tc>
+          <w:tcPr>
+            <w:tcW w:type="dxa" w:w="3230"/>
+          </w:tcPr>
+          <w:p>
+            <w:r>
+              <w:rPr>
+                <w:b/>
+                <w:sz w:val="18"/>
+              </w:rPr>
+              <w:t>Modelo</w:t>
+            </w:r>
+          </w:p>
+        </w:tc>
+        <w:tc>
+          <w:tcPr>
+            <w:tcW w:type="dxa" w:w="3230"/>
+          </w:tcPr>
+          <w:p>
+            <w:r>
+              <w:rPr>
+                <w:b/>
+                <w:sz w:val="18"/>
+              </w:rPr>
+              <w:t>Valida</w:t>
+            </w:r>
+          </w:p>
+        </w:tc>
+        <w:tc>
+          <w:tcPr>
+            <w:tcW w:type="dxa" w:w="3230"/>
+          </w:tcPr>
+          <w:p>
+            <w:r>
+              <w:rPr>
+                <w:b/>
+                <w:sz w:val="18"/>
+              </w:rPr>
+              <w:t>Propiedades</w:t>
+            </w:r>
+          </w:p>
+        </w:tc>
+      </w:tr>
+      <w:tr>
+        <w:tc>
+          <w:tcPr>
+            <w:tcW w:type="dxa" w:w="3230"/>
+          </w:tcPr>
+          <w:p>
+            <w:r>
+              <w:rPr>
+                <w:sz w:val="18"/>
+              </w:rPr>
+              <w:t>--------</w:t>
+            </w:r>
+          </w:p>
+        </w:tc>
+        <w:tc>
+          <w:tcPr>
+            <w:tcW w:type="dxa" w:w="3230"/>
+          </w:tcPr>
+          <w:p>
+            <w:r>
+              <w:rPr>
+                <w:sz w:val="18"/>
+              </w:rPr>
+              <w:t>--------</w:t>
+            </w:r>
+          </w:p>
+        </w:tc>
+        <w:tc>
+          <w:tcPr>
+            <w:tcW w:type="dxa" w:w="3230"/>
+          </w:tcPr>
+          <w:p>
+            <w:r>
+              <w:rPr>
+                <w:sz w:val="18"/>
+              </w:rPr>
+              <w:t>-------------</w:t>
+            </w:r>
+          </w:p>
+        </w:tc>
+      </w:tr>
+      <w:tr>
+        <w:tc>
+          <w:tcPr>
+            <w:tcW w:type="dxa" w:w="3230"/>
+          </w:tcPr>
+          <w:p>
+            <w:r>
+              <w:rPr>
+                <w:sz w:val="18"/>
+              </w:rPr>
+              <w:t>Trabajador</w:t>
+            </w:r>
+          </w:p>
+        </w:tc>
+        <w:tc>
+          <w:tcPr>
+            <w:tcW w:type="dxa" w:w="3230"/>
+          </w:tcPr>
+          <w:p>
+            <w:r>
+              <w:rPr>
+                <w:sz w:val="18"/>
+              </w:rPr>
+              <w:t>id_empleado, cargo, turno (4), estado (7), tipo_contrato (4)</w:t>
+            </w:r>
+          </w:p>
+        </w:tc>
+        <w:tc>
+          <w:tcPr>
+            <w:tcW w:type="dxa" w:w="3230"/>
+          </w:tcPr>
+          <w:p>
+            <w:r>
+              <w:rPr>
+                <w:sz w:val="18"/>
+              </w:rPr>
+              <w:t>en_ausencia, dias_para_retorno</w:t>
+            </w:r>
+          </w:p>
+        </w:tc>
+      </w:tr>
+      <w:tr>
+        <w:tc>
+          <w:tcPr>
+            <w:tcW w:type="dxa" w:w="3230"/>
+          </w:tcPr>
+          <w:p>
+            <w:r>
+              <w:rPr>
+                <w:sz w:val="18"/>
+              </w:rPr>
+              <w:t>AusenciaInput</w:t>
+            </w:r>
+          </w:p>
+        </w:tc>
+        <w:tc>
+          <w:tcPr>
+            <w:tcW w:type="dxa" w:w="3230"/>
+          </w:tcPr>
+          <w:p>
+            <w:r>
+              <w:rPr>
+                <w:sz w:val="18"/>
+              </w:rPr>
+              <w:t>tipo (6), fechas ISO YYYY-MM-DD</w:t>
+            </w:r>
+          </w:p>
+        </w:tc>
+        <w:tc>
+          <w:tcPr>
+            <w:tcW w:type="dxa" w:w="3230"/>
+          </w:tcPr>
+          <w:p>
+            <w:r>
+              <w:rPr>
+                <w:sz w:val="18"/>
+              </w:rPr>
+              <w:t>-</w:t>
+            </w:r>
+          </w:p>
+        </w:tc>
+      </w:tr>
+      <w:tr>
+        <w:tc>
+          <w:tcPr>
+            <w:tcW w:type="dxa" w:w="3230"/>
+          </w:tcPr>
+          <w:p>
+            <w:r>
+              <w:rPr>
+                <w:sz w:val="18"/>
+              </w:rPr>
+              <w:t>ReincorporarInput</w:t>
+            </w:r>
+          </w:p>
+        </w:tc>
+        <w:tc>
+          <w:tcPr>
+            <w:tcW w:type="dxa" w:w="3230"/>
+          </w:tcPr>
+          <w:p>
+            <w:r>
+              <w:rPr>
+                <w:sz w:val="18"/>
+              </w:rPr>
+              <w:t>id_empleado</w:t>
+            </w:r>
+          </w:p>
+        </w:tc>
+        <w:tc>
+          <w:tcPr>
+            <w:tcW w:type="dxa" w:w="3230"/>
+          </w:tcPr>
+          <w:p>
+            <w:r>
+              <w:rPr>
+                <w:sz w:val="18"/>
+              </w:rPr>
+              <w:t>-</w:t>
+            </w:r>
+          </w:p>
+        </w:tc>
+      </w:tr>
+      <w:tr>
+        <w:tc>
+          <w:tcPr>
+            <w:tcW w:type="dxa" w:w="3230"/>
+          </w:tcPr>
+          <w:p>
+            <w:r>
+              <w:rPr>
+                <w:sz w:val="18"/>
+              </w:rPr>
+              <w:t>PermisoRapidoInput</w:t>
+            </w:r>
+          </w:p>
+        </w:tc>
+        <w:tc>
+          <w:tcPr>
+            <w:tcW w:type="dxa" w:w="3230"/>
+          </w:tcPr>
+          <w:p>
+            <w:r>
+              <w:rPr>
+                <w:sz w:val="18"/>
+              </w:rPr>
+              <w:t>mensaje 10-500 chars</w:t>
+            </w:r>
+          </w:p>
+        </w:tc>
+        <w:tc>
+          <w:tcPr>
+            <w:tcW w:type="dxa" w:w="3230"/>
+          </w:tcPr>
+          <w:p>
+            <w:r>
+              <w:rPr>
+                <w:sz w:val="18"/>
+              </w:rPr>
+              <w:t>-</w:t>
+            </w:r>
+          </w:p>
+        </w:tc>
+      </w:tr>
+    </w:tbl>
+    <w:p/>
+    <w:p>
+      <w:pPr>
+        <w:spacing w:before="200"/>
+      </w:pPr>
+      <w:r>
+        <w:rPr>
+          <w:b/>
+          <w:color w:val="1E3A8A"/>
+          <w:sz w:val="24"/>
+        </w:rPr>
+        <w:t>Mermas (2)</w:t>
+      </w:r>
+    </w:p>
+    <w:tbl>
+      <w:tblPr>
+        <w:tblStyle w:val="LightGrid-Accent1"/>
+        <w:tblW w:type="auto" w:w="0"/>
+        <w:jc w:val="center"/>
+        <w:tblLook w:firstColumn="1" w:firstRow="1" w:lastColumn="0" w:lastRow="0" w:noHBand="0" w:noVBand="1" w:val="04A0"/>
+      </w:tblPr>
+      <w:tblGrid>
+        <w:gridCol w:w="4844"/>
+        <w:gridCol w:w="4844"/>
+      </w:tblGrid>
+      <w:tr>
+        <w:tc>
+          <w:tcPr>
+            <w:tcW w:type="dxa" w:w="4844"/>
+          </w:tcPr>
+          <w:p>
+            <w:r>
+              <w:rPr>
+                <w:b/>
+                <w:sz w:val="18"/>
+              </w:rPr>
+              <w:t>Modelo</w:t>
+            </w:r>
+          </w:p>
+        </w:tc>
+        <w:tc>
+          <w:tcPr>
+            <w:tcW w:type="dxa" w:w="4844"/>
+          </w:tcPr>
+          <w:p>
+            <w:r>
+              <w:rPr>
+                <w:b/>
+                <w:sz w:val="18"/>
+              </w:rPr>
+              <w:t>Valida</w:t>
+            </w:r>
+          </w:p>
+        </w:tc>
+      </w:tr>
+      <w:tr>
+        <w:tc>
+          <w:tcPr>
+            <w:tcW w:type="dxa" w:w="4844"/>
+          </w:tcPr>
+          <w:p>
+            <w:r>
+              <w:rPr>
+                <w:sz w:val="18"/>
+              </w:rPr>
+              <w:t>--------</w:t>
+            </w:r>
+          </w:p>
+        </w:tc>
+        <w:tc>
+          <w:tcPr>
+            <w:tcW w:type="dxa" w:w="4844"/>
+          </w:tcPr>
+          <w:p>
+            <w:r>
+              <w:rPr>
+                <w:sz w:val="18"/>
+              </w:rPr>
+              <w:t>--------</w:t>
+            </w:r>
+          </w:p>
+        </w:tc>
+      </w:tr>
+      <w:tr>
+        <w:tc>
+          <w:tcPr>
+            <w:tcW w:type="dxa" w:w="4844"/>
+          </w:tcPr>
+          <w:p>
+            <w:r>
+              <w:rPr>
+                <w:sz w:val="18"/>
+              </w:rPr>
+              <w:t>MermaInput</w:t>
+            </w:r>
+          </w:p>
+        </w:tc>
+        <w:tc>
+          <w:tcPr>
+            <w:tcW w:type="dxa" w:w="4844"/>
+          </w:tcPr>
+          <w:p>
+            <w:r>
+              <w:rPr>
+                <w:sz w:val="18"/>
+              </w:rPr>
+              <w:t>producto, cantidad&gt;0, costo&gt;=0</w:t>
+            </w:r>
+          </w:p>
+        </w:tc>
+      </w:tr>
+      <w:tr>
+        <w:tc>
+          <w:tcPr>
+            <w:tcW w:type="dxa" w:w="4844"/>
+          </w:tcPr>
+          <w:p>
+            <w:r>
+              <w:rPr>
+                <w:sz w:val="18"/>
+              </w:rPr>
+              <w:t>MermaReporteOutput</w:t>
+            </w:r>
+          </w:p>
+        </w:tc>
+        <w:tc>
+          <w:tcPr>
+            <w:tcW w:type="dxa" w:w="4844"/>
+          </w:tcPr>
+          <w:p>
+            <w:r>
+              <w:rPr>
+                <w:sz w:val="18"/>
+              </w:rPr>
+              <w:t>periodo_dias, totales, por_tipo, por_dia, top_productos</w:t>
+            </w:r>
+          </w:p>
+        </w:tc>
+      </w:tr>
+    </w:tbl>
+    <w:p/>
+    <w:p>
+      <w:pPr>
+        <w:spacing w:before="200"/>
+      </w:pPr>
+      <w:r>
+        <w:rPr>
+          <w:b/>
+          <w:color w:val="1E3A8A"/>
+          <w:sz w:val="24"/>
+        </w:rPr>
+        <w:t>Compras e Inventario (3)</w:t>
+      </w:r>
+    </w:p>
+    <w:tbl>
+      <w:tblPr>
+        <w:tblStyle w:val="LightGrid-Accent1"/>
+        <w:tblW w:type="auto" w:w="0"/>
+        <w:jc w:val="center"/>
+        <w:tblLook w:firstColumn="1" w:firstRow="1" w:lastColumn="0" w:lastRow="0" w:noHBand="0" w:noVBand="1" w:val="04A0"/>
+      </w:tblPr>
+      <w:tblGrid>
+        <w:gridCol w:w="4844"/>
+        <w:gridCol w:w="4844"/>
+      </w:tblGrid>
+      <w:tr>
+        <w:tc>
+          <w:tcPr>
+            <w:tcW w:type="dxa" w:w="4844"/>
+          </w:tcPr>
+          <w:p>
+            <w:r>
+              <w:rPr>
+                <w:b/>
+                <w:sz w:val="18"/>
+              </w:rPr>
+              <w:t>Modelo</w:t>
+            </w:r>
+          </w:p>
+        </w:tc>
+        <w:tc>
+          <w:tcPr>
+            <w:tcW w:type="dxa" w:w="4844"/>
+          </w:tcPr>
+          <w:p>
+            <w:r>
+              <w:rPr>
+                <w:b/>
+                <w:sz w:val="18"/>
+              </w:rPr>
+              <w:t>Valida</w:t>
+            </w:r>
+          </w:p>
+        </w:tc>
+      </w:tr>
+      <w:tr>
+        <w:tc>
+          <w:tcPr>
+            <w:tcW w:type="dxa" w:w="4844"/>
+          </w:tcPr>
+          <w:p>
+            <w:r>
+              <w:rPr>
+                <w:sz w:val="18"/>
+              </w:rPr>
+              <w:t>--------</w:t>
+            </w:r>
+          </w:p>
+        </w:tc>
+        <w:tc>
+          <w:tcPr>
+            <w:tcW w:type="dxa" w:w="4844"/>
+          </w:tcPr>
+          <w:p>
+            <w:r>
+              <w:rPr>
+                <w:sz w:val="18"/>
+              </w:rPr>
+              <w:t>--------</w:t>
+            </w:r>
+          </w:p>
+        </w:tc>
+      </w:tr>
+      <w:tr>
+        <w:tc>
+          <w:tcPr>
+            <w:tcW w:type="dxa" w:w="4844"/>
+          </w:tcPr>
+          <w:p>
+            <w:r>
+              <w:rPr>
+                <w:sz w:val="18"/>
+              </w:rPr>
+              <w:t>CompraInput</w:t>
+            </w:r>
+          </w:p>
+        </w:tc>
+        <w:tc>
+          <w:tcPr>
+            <w:tcW w:type="dxa" w:w="4844"/>
+          </w:tcPr>
+          <w:p>
+            <w:r>
+              <w:rPr>
+                <w:sz w:val="18"/>
+              </w:rPr>
+              <w:t>mensaje, cant&gt;0, categoria</w:t>
+            </w:r>
+          </w:p>
+        </w:tc>
+      </w:tr>
+      <w:tr>
+        <w:tc>
+          <w:tcPr>
+            <w:tcW w:type="dxa" w:w="4844"/>
+          </w:tcPr>
+          <w:p>
+            <w:r>
+              <w:rPr>
+                <w:sz w:val="18"/>
+              </w:rPr>
+              <w:t>BajaInventarioInput</w:t>
+            </w:r>
+          </w:p>
+        </w:tc>
+        <w:tc>
+          <w:tcPr>
+            <w:tcW w:type="dxa" w:w="4844"/>
+          </w:tcPr>
+          <w:p>
+            <w:r>
+              <w:rPr>
+                <w:sz w:val="18"/>
+              </w:rPr>
+              <w:t>producto, cant&gt;0, motivo, costo&gt;=0</w:t>
+            </w:r>
+          </w:p>
+        </w:tc>
+      </w:tr>
+      <w:tr>
+        <w:tc>
+          <w:tcPr>
+            <w:tcW w:type="dxa" w:w="4844"/>
+          </w:tcPr>
+          <w:p>
+            <w:r>
+              <w:rPr>
+                <w:sz w:val="18"/>
+              </w:rPr>
+              <w:t>Inventario (actualizado)</w:t>
+            </w:r>
+          </w:p>
+        </w:tc>
+        <w:tc>
+          <w:tcPr>
+            <w:tcW w:type="dxa" w:w="4844"/>
+          </w:tcPr>
+          <w:p>
+            <w:r>
+              <w:rPr>
+                <w:sz w:val="18"/>
+              </w:rPr>
+              <w:t>35 unidades validas (antes 8)</w:t>
+            </w:r>
+          </w:p>
+        </w:tc>
+      </w:tr>
+    </w:tbl>
+    <w:p/>
+    <w:p>
+      <w:pPr>
+        <w:spacing w:before="200"/>
+      </w:pPr>
+      <w:r>
+        <w:rPr>
+          <w:b/>
+          <w:color w:val="1E3A8A"/>
+          <w:sz w:val="24"/>
+        </w:rPr>
+        <w:t>Menu (2)</w:t>
+      </w:r>
+    </w:p>
+    <w:tbl>
+      <w:tblPr>
+        <w:tblStyle w:val="LightGrid-Accent1"/>
+        <w:tblW w:type="auto" w:w="0"/>
+        <w:jc w:val="center"/>
+        <w:tblLook w:firstColumn="1" w:firstRow="1" w:lastColumn="0" w:lastRow="0" w:noHBand="0" w:noVBand="1" w:val="04A0"/>
+      </w:tblPr>
+      <w:tblGrid>
+        <w:gridCol w:w="4844"/>
+        <w:gridCol w:w="4844"/>
+      </w:tblGrid>
+      <w:tr>
+        <w:tc>
+          <w:tcPr>
+            <w:tcW w:type="dxa" w:w="4844"/>
+          </w:tcPr>
+          <w:p>
+            <w:r>
+              <w:rPr>
+                <w:b/>
+                <w:sz w:val="18"/>
+              </w:rPr>
+              <w:t>Modelo</w:t>
+            </w:r>
+          </w:p>
+        </w:tc>
+        <w:tc>
+          <w:tcPr>
+            <w:tcW w:type="dxa" w:w="4844"/>
+          </w:tcPr>
+          <w:p>
+            <w:r>
+              <w:rPr>
+                <w:b/>
+                <w:sz w:val="18"/>
+              </w:rPr>
+              <w:t>Valida</w:t>
+            </w:r>
+          </w:p>
+        </w:tc>
+      </w:tr>
+      <w:tr>
+        <w:tc>
+          <w:tcPr>
+            <w:tcW w:type="dxa" w:w="4844"/>
+          </w:tcPr>
+          <w:p>
+            <w:r>
+              <w:rPr>
+                <w:sz w:val="18"/>
+              </w:rPr>
+              <w:t>--------</w:t>
+            </w:r>
+          </w:p>
+        </w:tc>
+        <w:tc>
+          <w:tcPr>
+            <w:tcW w:type="dxa" w:w="4844"/>
+          </w:tcPr>
+          <w:p>
+            <w:r>
+              <w:rPr>
+                <w:sz w:val="18"/>
+              </w:rPr>
+              <w:t>--------</w:t>
+            </w:r>
+          </w:p>
+        </w:tc>
+      </w:tr>
+      <w:tr>
+        <w:tc>
+          <w:tcPr>
+            <w:tcW w:type="dxa" w:w="4844"/>
+          </w:tcPr>
+          <w:p>
+            <w:r>
+              <w:rPr>
+                <w:sz w:val="18"/>
+              </w:rPr>
+              <w:t>MenuPlato</w:t>
+            </w:r>
+          </w:p>
+        </w:tc>
+        <w:tc>
+          <w:tcPr>
+            <w:tcW w:type="dxa" w:w="4844"/>
+          </w:tcPr>
+          <w:p>
+            <w:r>
+              <w:rPr>
+                <w:sz w:val="18"/>
+              </w:rPr>
+              <w:t>dia (7), servicio (6: desayuno, almuerzo, merienda, cena, a_la_carta, especial), precio&gt;=0</w:t>
+            </w:r>
+          </w:p>
+        </w:tc>
+      </w:tr>
+      <w:tr>
+        <w:tc>
+          <w:tcPr>
+            <w:tcW w:type="dxa" w:w="4844"/>
+          </w:tcPr>
+          <w:p>
+            <w:r>
+              <w:rPr>
+                <w:sz w:val="18"/>
+              </w:rPr>
+              <w:t>MenuSemanalOutput</w:t>
+            </w:r>
+          </w:p>
+        </w:tc>
+        <w:tc>
+          <w:tcPr>
+            <w:tcW w:type="dxa" w:w="4844"/>
+          </w:tcPr>
+          <w:p>
+            <w:r>
+              <w:rPr>
+                <w:sz w:val="18"/>
+              </w:rPr>
+              <w:t>semana, platos[], costo_promedio</w:t>
+            </w:r>
+          </w:p>
+        </w:tc>
+      </w:tr>
+    </w:tbl>
+    <w:p/>
+    <w:p>
+      <w:pPr>
+        <w:spacing w:before="200"/>
+      </w:pPr>
+      <w:r>
+        <w:rPr>
+          <w:b/>
+          <w:color w:val="1E3A8A"/>
+          <w:sz w:val="24"/>
+        </w:rPr>
+        <w:t>Documentos y Alertas (2)</w:t>
+      </w:r>
+    </w:p>
+    <w:tbl>
+      <w:tblPr>
+        <w:tblStyle w:val="LightGrid-Accent1"/>
+        <w:tblW w:type="auto" w:w="0"/>
+        <w:jc w:val="center"/>
+        <w:tblLook w:firstColumn="1" w:firstRow="1" w:lastColumn="0" w:lastRow="0" w:noHBand="0" w:noVBand="1" w:val="04A0"/>
+      </w:tblPr>
+      <w:tblGrid>
+        <w:gridCol w:w="4844"/>
+        <w:gridCol w:w="4844"/>
+      </w:tblGrid>
+      <w:tr>
+        <w:tc>
+          <w:tcPr>
+            <w:tcW w:type="dxa" w:w="4844"/>
+          </w:tcPr>
+          <w:p>
+            <w:r>
+              <w:rPr>
+                <w:b/>
+                <w:sz w:val="18"/>
+              </w:rPr>
+              <w:t>Modelo</w:t>
+            </w:r>
+          </w:p>
+        </w:tc>
+        <w:tc>
+          <w:tcPr>
+            <w:tcW w:type="dxa" w:w="4844"/>
+          </w:tcPr>
+          <w:p>
+            <w:r>
+              <w:rPr>
+                <w:b/>
+                <w:sz w:val="18"/>
+              </w:rPr>
+              <w:t>Valida</w:t>
+            </w:r>
+          </w:p>
+        </w:tc>
+      </w:tr>
+      <w:tr>
+        <w:tc>
+          <w:tcPr>
+            <w:tcW w:type="dxa" w:w="4844"/>
+          </w:tcPr>
+          <w:p>
+            <w:r>
+              <w:rPr>
+                <w:sz w:val="18"/>
+              </w:rPr>
+              <w:t>--------</w:t>
+            </w:r>
+          </w:p>
+        </w:tc>
+        <w:tc>
+          <w:tcPr>
+            <w:tcW w:type="dxa" w:w="4844"/>
+          </w:tcPr>
+          <w:p>
+            <w:r>
+              <w:rPr>
+                <w:sz w:val="18"/>
+              </w:rPr>
+              <w:t>--------</w:t>
+            </w:r>
+          </w:p>
+        </w:tc>
+      </w:tr>
+      <w:tr>
+        <w:tc>
+          <w:tcPr>
+            <w:tcW w:type="dxa" w:w="4844"/>
+          </w:tcPr>
+          <w:p>
+            <w:r>
+              <w:rPr>
+                <w:sz w:val="18"/>
+              </w:rPr>
+              <w:t>DocumentoRAGModel</w:t>
+            </w:r>
+          </w:p>
+        </w:tc>
+        <w:tc>
+          <w:tcPr>
+            <w:tcW w:type="dxa" w:w="4844"/>
+          </w:tcPr>
+          <w:p>
+            <w:r>
+              <w:rPr>
+                <w:sz w:val="18"/>
+              </w:rPr>
+              <w:t>tipo (7: receta, catalogo, lotes, manual_bpm, generico, capacitacion, personal)</w:t>
+            </w:r>
+          </w:p>
+        </w:tc>
+      </w:tr>
+      <w:tr>
+        <w:tc>
+          <w:tcPr>
+            <w:tcW w:type="dxa" w:w="4844"/>
+          </w:tcPr>
+          <w:p>
+            <w:r>
+              <w:rPr>
+                <w:sz w:val="18"/>
+              </w:rPr>
+              <w:t>AlertasOutput</w:t>
+            </w:r>
+          </w:p>
+        </w:tc>
+        <w:tc>
+          <w:tcPr>
+            <w:tcW w:type="dxa" w:w="4844"/>
+          </w:tcPr>
+          <w:p>
+            <w:r>
+              <w:rPr>
+                <w:sz w:val="18"/>
+              </w:rPr>
+              <w:t>personal_ausente[], productos_por_caducar[], stock_bajo[], sugerencias[]</w:t>
+            </w:r>
+          </w:p>
+        </w:tc>
+      </w:tr>
+    </w:tbl>
+    <w:p/>
+    <w:p>
+      <w:pPr>
+        <w:spacing w:before="200"/>
+      </w:pPr>
+      <w:r>
+        <w:rPr>
+          <w:b/>
+          <w:color w:val="1E3A8A"/>
+          <w:sz w:val="24"/>
+        </w:rPr>
+        <w:t>Legacy (11)</w:t>
+      </w:r>
+    </w:p>
+    <w:p>
+      <w:pPr>
+        <w:spacing w:after="120"/>
+      </w:pPr>
+      <w:r>
+        <w:t>Ingrediente, Receta, Evento, AccionOffice, Catalogo, VistaCaducidad, BitacoraDiaria, VentasHistoricas, IncidenciaInput, UsoInventarioInput, EscalarRecetaInput, CaducidadInput, AnalisisRentabilidadOutput</w:t>
+      </w:r>
+    </w:p>
+    <w:p>
+      <w:pPr>
+        <w:spacing w:before="280"/>
+      </w:pPr>
+      <w:r>
+        <w:rPr>
+          <w:b/>
+          <w:color w:val="1E3A8A"/>
+          <w:sz w:val="28"/>
+        </w:rPr>
         <w:t>8. Exportacion a Office (Mejorado)</w:t>
       </w:r>
     </w:p>
@@ -3547,7 +4461,7 @@
           <w:color w:val="1E3A8A"/>
           <w:sz w:val="24"/>
         </w:rPr>
-        <w:t>Suite de Tests (38 tests)</w:t>
+        <w:t>Suite de Tests (51 tests)</w:t>
       </w:r>
     </w:p>
     <w:tbl>
@@ -3755,6 +4669,34 @@
                 <w:sz w:val="18"/>
               </w:rPr>
               <w:t>3</w:t>
+            </w:r>
+          </w:p>
+        </w:tc>
+      </w:tr>
+      <w:tr>
+        <w:tc>
+          <w:tcPr>
+            <w:tcW w:type="dxa" w:w="4844"/>
+          </w:tcPr>
+          <w:p>
+            <w:r>
+              <w:rPr>
+                <w:sz w:val="18"/>
+              </w:rPr>
+              <w:t>Modelos Pydantic</w:t>
+            </w:r>
+          </w:p>
+        </w:tc>
+        <w:tc>
+          <w:tcPr>
+            <w:tcW w:type="dxa" w:w="4844"/>
+          </w:tcPr>
+          <w:p>
+            <w:r>
+              <w:rPr>
+                <w:sz w:val="18"/>
+              </w:rPr>
+              <w:t>13</w:t>
             </w:r>
           </w:p>
         </w:tc>

</xml_diff>